<commit_message>
Python Fundamentals | formatting strings
</commit_message>
<xml_diff>
--- a/ReadMe/Python_Fundamentals_1.docx
+++ b/ReadMe/Python_Fundamentals_1.docx
@@ -221,16 +221,6 @@
               <w:t>Python is simple to learn</w:t>
             </w:r>
           </w:p>
-          <w:p>
-            <w:pPr>
-              <w:pStyle w:val="TipText"/>
-              <w:cnfStyle w:val="000000000000" w:firstRow="0" w:lastRow="0" w:firstColumn="0" w:lastColumn="0" w:oddVBand="0" w:evenVBand="0" w:oddHBand="0" w:evenHBand="0" w:firstRowFirstColumn="0" w:firstRowLastColumn="0" w:lastRowFirstColumn="0" w:lastRowLastColumn="0"/>
-              <w:rPr>
-                <w:sz w:val="22"/>
-                <w:szCs w:val="22"/>
-              </w:rPr>
-            </w:pPr>
-          </w:p>
         </w:tc>
       </w:tr>
     </w:tbl>
@@ -239,6 +229,9 @@
       <w:pPr>
         <w:pStyle w:val="Heading2"/>
       </w:pPr>
+      <w:r>
+        <w:t>What are Python Variables, Snake case/Constants, Print, Mathematical preferences?</w:t>
+      </w:r>
     </w:p>
     <w:tbl>
       <w:tblPr>
@@ -259,9 +252,17 @@
             <w:shd w:val="clear" w:color="auto" w:fill="auto"/>
           </w:tcPr>
           <w:p>
+            <w:pPr>
+              <w:rPr>
+                <w:sz w:val="22"/>
+                <w:szCs w:val="22"/>
+              </w:rPr>
+            </w:pPr>
             <w:r>
               <w:rPr>
                 <w:noProof/>
+                <w:sz w:val="22"/>
+                <w:szCs w:val="22"/>
               </w:rPr>
               <w:drawing>
                 <wp:inline distT="0" distB="0" distL="0" distR="0" wp14:anchorId="08710525" wp14:editId="72DF0952">
@@ -319,12 +320,305 @@
             <w:pPr>
               <w:pStyle w:val="TipText"/>
               <w:cnfStyle w:val="000000000000" w:firstRow="0" w:lastRow="0" w:firstColumn="0" w:lastColumn="0" w:oddVBand="0" w:evenVBand="0" w:oddHBand="0" w:evenHBand="0" w:firstRowFirstColumn="0" w:firstRowLastColumn="0" w:lastRowFirstColumn="0" w:lastRowLastColumn="0"/>
+              <w:rPr>
+                <w:sz w:val="22"/>
+                <w:szCs w:val="22"/>
+              </w:rPr>
             </w:pPr>
+            <w:r>
+              <w:rPr>
+                <w:b/>
+                <w:bCs/>
+                <w:sz w:val="22"/>
+                <w:szCs w:val="22"/>
+              </w:rPr>
+              <w:t>Variables</w:t>
+            </w:r>
+            <w:r>
+              <w:rPr>
+                <w:sz w:val="22"/>
+                <w:szCs w:val="22"/>
+              </w:rPr>
+              <w:t xml:space="preserve"> in Python by best practice should be </w:t>
+            </w:r>
+            <w:r>
+              <w:rPr>
+                <w:b/>
+                <w:bCs/>
+                <w:sz w:val="22"/>
+                <w:szCs w:val="22"/>
+              </w:rPr>
+              <w:t>Snake-Case</w:t>
+            </w:r>
+            <w:r>
+              <w:rPr>
+                <w:sz w:val="22"/>
+                <w:szCs w:val="22"/>
+              </w:rPr>
+              <w:t xml:space="preserve"> and </w:t>
+            </w:r>
+            <w:r>
+              <w:rPr>
+                <w:b/>
+                <w:bCs/>
+                <w:sz w:val="22"/>
+                <w:szCs w:val="22"/>
+              </w:rPr>
+              <w:t>Constants</w:t>
+            </w:r>
+            <w:r>
+              <w:rPr>
+                <w:sz w:val="22"/>
+                <w:szCs w:val="22"/>
+              </w:rPr>
+              <w:t xml:space="preserve"> need to be </w:t>
+            </w:r>
+            <w:r>
+              <w:rPr>
+                <w:b/>
+                <w:bCs/>
+                <w:sz w:val="22"/>
+                <w:szCs w:val="22"/>
+              </w:rPr>
+              <w:t>UPPERCASE</w:t>
+            </w:r>
+            <w:r>
+              <w:rPr>
+                <w:sz w:val="22"/>
+                <w:szCs w:val="22"/>
+              </w:rPr>
+              <w:t xml:space="preserve"> for programming consistency/readability. </w:t>
+            </w:r>
+            <w:r>
+              <w:rPr>
+                <w:sz w:val="22"/>
+                <w:szCs w:val="22"/>
+              </w:rPr>
+              <w:br/>
+            </w:r>
+            <w:r>
+              <w:rPr>
+                <w:sz w:val="22"/>
+                <w:szCs w:val="22"/>
+              </w:rPr>
+              <w:br/>
+            </w:r>
+            <w:r>
+              <w:rPr>
+                <w:b/>
+                <w:bCs/>
+                <w:sz w:val="22"/>
+                <w:szCs w:val="22"/>
+              </w:rPr>
+              <w:t>Print</w:t>
+            </w:r>
+            <w:r>
+              <w:rPr>
+                <w:sz w:val="22"/>
+                <w:szCs w:val="22"/>
+              </w:rPr>
+              <w:t xml:space="preserve"> has the basic format of print(variable) OR print(“string”) OR print(number)</w:t>
+            </w:r>
+          </w:p>
+          <w:p>
+            <w:pPr>
+              <w:pStyle w:val="TipText"/>
+              <w:cnfStyle w:val="000000000000" w:firstRow="0" w:lastRow="0" w:firstColumn="0" w:lastColumn="0" w:oddVBand="0" w:evenVBand="0" w:oddHBand="0" w:evenHBand="0" w:firstRowFirstColumn="0" w:firstRowLastColumn="0" w:lastRowFirstColumn="0" w:lastRowLastColumn="0"/>
+              <w:rPr>
+                <w:b/>
+                <w:bCs/>
+                <w:sz w:val="22"/>
+                <w:szCs w:val="22"/>
+              </w:rPr>
+            </w:pPr>
+            <w:r>
+              <w:rPr>
+                <w:sz w:val="22"/>
+                <w:szCs w:val="22"/>
+              </w:rPr>
+              <w:t xml:space="preserve">The </w:t>
+            </w:r>
+            <w:r>
+              <w:rPr>
+                <w:b/>
+                <w:bCs/>
+                <w:sz w:val="22"/>
+                <w:szCs w:val="22"/>
+              </w:rPr>
+              <w:t>preference</w:t>
+            </w:r>
+            <w:r>
+              <w:rPr>
+                <w:sz w:val="22"/>
+                <w:szCs w:val="22"/>
+              </w:rPr>
+              <w:t xml:space="preserve"> in Python for </w:t>
+            </w:r>
+            <w:r>
+              <w:rPr>
+                <w:b/>
+                <w:bCs/>
+                <w:sz w:val="22"/>
+                <w:szCs w:val="22"/>
+              </w:rPr>
+              <w:t>Mathematical Operations</w:t>
+            </w:r>
+            <w:r>
+              <w:rPr>
+                <w:sz w:val="22"/>
+                <w:szCs w:val="22"/>
+              </w:rPr>
+              <w:t xml:space="preserve"> is </w:t>
+            </w:r>
+            <w:r>
+              <w:rPr>
+                <w:b/>
+                <w:bCs/>
+                <w:sz w:val="22"/>
+                <w:szCs w:val="22"/>
+              </w:rPr>
+              <w:t>Multiplication</w:t>
+            </w:r>
+            <w:r>
+              <w:rPr>
+                <w:sz w:val="22"/>
+                <w:szCs w:val="22"/>
+              </w:rPr>
+              <w:t xml:space="preserve">, </w:t>
+            </w:r>
+            <w:r>
+              <w:rPr>
+                <w:b/>
+                <w:bCs/>
+                <w:sz w:val="22"/>
+                <w:szCs w:val="22"/>
+              </w:rPr>
+              <w:t>Division</w:t>
+            </w:r>
+            <w:r>
+              <w:rPr>
+                <w:sz w:val="22"/>
+                <w:szCs w:val="22"/>
+              </w:rPr>
+              <w:t xml:space="preserve">, </w:t>
+            </w:r>
+            <w:r>
+              <w:rPr>
+                <w:b/>
+                <w:bCs/>
+                <w:sz w:val="22"/>
+                <w:szCs w:val="22"/>
+              </w:rPr>
+              <w:t>Addition</w:t>
+            </w:r>
+            <w:r>
+              <w:rPr>
+                <w:sz w:val="22"/>
+                <w:szCs w:val="22"/>
+              </w:rPr>
+              <w:t xml:space="preserve"> followed by </w:t>
+            </w:r>
+            <w:r>
+              <w:rPr>
+                <w:b/>
+                <w:bCs/>
+                <w:sz w:val="22"/>
+                <w:szCs w:val="22"/>
+              </w:rPr>
+              <w:t>Subtraction</w:t>
+            </w:r>
+            <w:r>
+              <w:rPr>
+                <w:b/>
+                <w:bCs/>
+                <w:sz w:val="22"/>
+                <w:szCs w:val="22"/>
+              </w:rPr>
+              <w:t>.</w:t>
+            </w:r>
+            <w:r>
+              <w:rPr>
+                <w:b/>
+                <w:bCs/>
+                <w:sz w:val="22"/>
+                <w:szCs w:val="22"/>
+              </w:rPr>
+              <w:br/>
+            </w:r>
+            <w:r>
+              <w:rPr>
+                <w:b/>
+                <w:bCs/>
+                <w:sz w:val="22"/>
+                <w:szCs w:val="22"/>
+              </w:rPr>
+              <w:br/>
+            </w:r>
+            <w:r>
+              <w:rPr>
+                <w:b/>
+                <w:bCs/>
+                <w:sz w:val="22"/>
+                <w:szCs w:val="22"/>
+              </w:rPr>
+              <w:t xml:space="preserve">Modulus </w:t>
+            </w:r>
+            <w:r>
+              <w:rPr>
+                <w:sz w:val="22"/>
+                <w:szCs w:val="22"/>
+              </w:rPr>
+              <w:t>in Python gives us the remainder</w:t>
+            </w:r>
+            <w:r>
+              <w:rPr>
+                <w:sz w:val="22"/>
+                <w:szCs w:val="22"/>
+              </w:rPr>
+              <w:br/>
+            </w:r>
+            <w:r>
+              <w:rPr>
+                <w:sz w:val="22"/>
+                <w:szCs w:val="22"/>
+              </w:rPr>
+              <w:t>.</w:t>
+            </w:r>
+            <w:r>
+              <w:rPr>
+                <w:sz w:val="22"/>
+                <w:szCs w:val="22"/>
+              </w:rPr>
+              <w:br/>
+            </w:r>
+            <w:r>
+              <w:rPr>
+                <w:b/>
+                <w:bCs/>
+                <w:sz w:val="22"/>
+                <w:szCs w:val="22"/>
+              </w:rPr>
+              <w:t>Division</w:t>
+            </w:r>
+            <w:r>
+              <w:rPr>
+                <w:sz w:val="22"/>
+                <w:szCs w:val="22"/>
+              </w:rPr>
+              <w:t xml:space="preserve"> two times negates the decimal values in quotient.</w:t>
+            </w:r>
           </w:p>
         </w:tc>
       </w:tr>
     </w:tbl>
-    <w:p/>
+    <w:p>
+      <w:pPr>
+        <w:rPr>
+          <w:sz w:val="22"/>
+          <w:szCs w:val="22"/>
+        </w:rPr>
+      </w:pPr>
+    </w:p>
     <w:p>
       <w:pPr>
         <w:pStyle w:val="Heading2"/>
@@ -3011,8 +3305,8 @@
     <w:compatSetting w:name="useWord2013TrackBottomHyphenation" w:uri="http://schemas.microsoft.com/office/word" w:val="0"/>
   </w:compat>
   <w:rsids>
-    <w:rsidRoot w:val="00B87A77"/>
-    <w:rsid w:val="00B87A77"/>
+    <w:rsidRoot w:val="002178D7"/>
+    <w:rsid w:val="002178D7"/>
     <w:rsid w:val="00C00F23"/>
   </w:rsids>
   <m:mathPr>

</xml_diff>